<commit_message>
Add type-or-pick to master-data dropdowns app-wide; mobile-safe docx tables
</commit_message>
<xml_diff>
--- a/SLOT_Accounting_Training_Manual.docx
+++ b/SLOT_Accounting_Training_Manual.docx
@@ -106,6 +106,7 @@
           <w:insideH w:val="none" w:color="FFFFFF" w:sz="0"/>
           <w:insideV w:val="none" w:color="FFFFFF" w:sz="0"/>
         </w:tblBorders>
+        <w:tblLayout w:type="fixed"/>
       </w:tblPr>
       <w:tblGrid>
         <w:gridCol w:w="100"/>
@@ -644,6 +645,7 @@
           <w:insideH w:val="single" w:color="C9D6CE" w:sz="4"/>
           <w:insideV w:val="single" w:color="C9D6CE" w:sz="4"/>
         </w:tblBorders>
+        <w:tblLayout w:type="fixed"/>
       </w:tblPr>
       <w:tblGrid>
         <w:gridCol w:w="2400"/>
@@ -1522,6 +1524,7 @@
           <w:insideH w:val="single" w:color="C9D6CE" w:sz="4"/>
           <w:insideV w:val="single" w:color="C9D6CE" w:sz="4"/>
         </w:tblBorders>
+        <w:tblLayout w:type="fixed"/>
       </w:tblPr>
       <w:tblGrid>
         <w:gridCol w:w="3400"/>
@@ -2828,6 +2831,7 @@
           <w:insideH w:val="none" w:color="FFFFFF" w:sz="0"/>
           <w:insideV w:val="none" w:color="FFFFFF" w:sz="0"/>
         </w:tblBorders>
+        <w:tblLayout w:type="fixed"/>
       </w:tblPr>
       <w:tblGrid>
         <w:gridCol w:w="100"/>
@@ -3302,6 +3306,7 @@
           <w:insideH w:val="none" w:color="FFFFFF" w:sz="0"/>
           <w:insideV w:val="none" w:color="FFFFFF" w:sz="0"/>
         </w:tblBorders>
+        <w:tblLayout w:type="fixed"/>
       </w:tblPr>
       <w:tblGrid>
         <w:gridCol w:w="100"/>
@@ -3574,6 +3579,7 @@
           <w:insideH w:val="none" w:color="FFFFFF" w:sz="0"/>
           <w:insideV w:val="none" w:color="FFFFFF" w:sz="0"/>
         </w:tblBorders>
+        <w:tblLayout w:type="fixed"/>
       </w:tblPr>
       <w:tblGrid>
         <w:gridCol w:w="100"/>
@@ -3743,6 +3749,7 @@
           <w:insideH w:val="single" w:color="C9D6CE" w:sz="4"/>
           <w:insideV w:val="single" w:color="C9D6CE" w:sz="4"/>
         </w:tblBorders>
+        <w:tblLayout w:type="fixed"/>
       </w:tblPr>
       <w:tblGrid>
         <w:gridCol w:w="2400"/>

</xml_diff>